<commit_message>
ishihara finished, added evaluation
</commit_message>
<xml_diff>
--- a/ReColor_Defense_Reviewer_v2.docx
+++ b/ReColor_Defense_Reviewer_v2.docx
@@ -3693,7 +3693,16 @@
         <w:rPr>
           <w:color w:val="2E50B0"/>
         </w:rPr>
-        <w:t>3.6 — Why Daltonization beats Hue Rotation (rehearse this)</w:t>
+        <w:t>3.6 — Theoretical comparison (a priori)</w:t>
+      </w:r>
+    </w:p>
+    <w:p>
+      <w:r>
+        <w:rPr>
+          <w:b w:val="0"/>
+          <w:i/>
+        </w:rPr>
+        <w:t>On paper — before running any empirical test — Daltonization is the more principled choice. This table summarises the theoretical case. Section 3.6.1 then reports what the actual evaluation showed, which forces us to refine this position.</w:t>
       </w:r>
     </w:p>
     <w:tbl>
@@ -4027,6 +4036,568 @@
         <w:rPr>
           <w:color w:val="2E50B0"/>
         </w:rPr>
+        <w:t>3.6.1 — UPDATE: What the empirical evaluation actually showed</w:t>
+      </w:r>
+    </w:p>
+    <w:p>
+      <w:r>
+        <w:rPr>
+          <w:b/>
+          <w:i w:val="0"/>
+        </w:rPr>
+        <w:t>After the theoretical comparison above was written, we ran the algorithmic performance evaluation harness across 6 synthetic test images × 3 CVD types. The numerical results do NOT support the simple 'Daltonization beats Hue Rotation' claim, and you must be ready for panelists who have read the full report.</w:t>
+      </w:r>
+    </w:p>
+    <w:p>
+      <w:pPr>
+        <w:pStyle w:val="Heading3"/>
+      </w:pPr>
+      <w:r>
+        <w:rPr>
+          <w:color w:val="5070C0"/>
+        </w:rPr>
+        <w:t>3.6.1.1 — The aggregate numbers</w:t>
+      </w:r>
+    </w:p>
+    <w:tbl>
+      <w:tblPr>
+        <w:tblStyle w:val="LightGrid-Accent1"/>
+        <w:tblW w:type="auto" w:w="0"/>
+        <w:tblLook w:firstColumn="1" w:firstRow="1" w:lastColumn="0" w:lastRow="0" w:noHBand="0" w:noVBand="1" w:val="04A0"/>
+      </w:tblPr>
+      <w:tblGrid>
+        <w:gridCol w:w="2493"/>
+        <w:gridCol w:w="2493"/>
+        <w:gridCol w:w="2493"/>
+        <w:gridCol w:w="2493"/>
+      </w:tblGrid>
+      <w:tr>
+        <w:tc>
+          <w:tcPr>
+            <w:tcW w:type="dxa" w:w="3969"/>
+          </w:tcPr>
+          <w:p>
+            <w:r/>
+            <w:r>
+              <w:rPr>
+                <w:b/>
+                <w:sz w:val="20"/>
+              </w:rPr>
+              <w:t>Metric</w:t>
+            </w:r>
+          </w:p>
+        </w:tc>
+        <w:tc>
+          <w:tcPr>
+            <w:tcW w:type="dxa" w:w="1701"/>
+          </w:tcPr>
+          <w:p>
+            <w:r/>
+            <w:r>
+              <w:rPr>
+                <w:b/>
+                <w:sz w:val="20"/>
+              </w:rPr>
+              <w:t>Daltonization</w:t>
+            </w:r>
+          </w:p>
+        </w:tc>
+        <w:tc>
+          <w:tcPr>
+            <w:tcW w:type="dxa" w:w="1701"/>
+          </w:tcPr>
+          <w:p>
+            <w:r/>
+            <w:r>
+              <w:rPr>
+                <w:b/>
+                <w:sz w:val="20"/>
+              </w:rPr>
+              <w:t>Hue Rotation</w:t>
+            </w:r>
+          </w:p>
+        </w:tc>
+        <w:tc>
+          <w:tcPr>
+            <w:tcW w:type="dxa" w:w="1701"/>
+          </w:tcPr>
+          <w:p>
+            <w:r/>
+            <w:r>
+              <w:rPr>
+                <w:b/>
+                <w:sz w:val="20"/>
+              </w:rPr>
+              <w:t>Winner</w:t>
+            </w:r>
+          </w:p>
+        </w:tc>
+      </w:tr>
+      <w:tr>
+        <w:tc>
+          <w:tcPr>
+            <w:tcW w:type="dxa" w:w="3969"/>
+          </w:tcPr>
+          <w:p>
+            <w:r/>
+            <w:r>
+              <w:rPr>
+                <w:sz w:val="20"/>
+              </w:rPr>
+              <w:t>Suite 1: Mean ΔE (lower = closer to original normal view)</w:t>
+            </w:r>
+          </w:p>
+        </w:tc>
+        <w:tc>
+          <w:tcPr>
+            <w:tcW w:type="dxa" w:w="1701"/>
+          </w:tcPr>
+          <w:p>
+            <w:r/>
+            <w:r>
+              <w:rPr>
+                <w:sz w:val="20"/>
+              </w:rPr>
+              <w:t>15.29</w:t>
+            </w:r>
+          </w:p>
+        </w:tc>
+        <w:tc>
+          <w:tcPr>
+            <w:tcW w:type="dxa" w:w="1701"/>
+          </w:tcPr>
+          <w:p>
+            <w:r/>
+            <w:r>
+              <w:rPr>
+                <w:sz w:val="20"/>
+              </w:rPr>
+              <w:t>14.89</w:t>
+            </w:r>
+          </w:p>
+        </w:tc>
+        <w:tc>
+          <w:tcPr>
+            <w:tcW w:type="dxa" w:w="1701"/>
+          </w:tcPr>
+          <w:p>
+            <w:r/>
+            <w:r>
+              <w:rPr>
+                <w:sz w:val="20"/>
+              </w:rPr>
+              <w:t>HUE (marginal)</w:t>
+            </w:r>
+          </w:p>
+        </w:tc>
+      </w:tr>
+      <w:tr>
+        <w:tc>
+          <w:tcPr>
+            <w:tcW w:type="dxa" w:w="3969"/>
+          </w:tcPr>
+          <w:p>
+            <w:r/>
+            <w:r>
+              <w:rPr>
+                <w:sz w:val="20"/>
+              </w:rPr>
+              <w:t>Suite 2: SSIM (higher = more structural preservation)</w:t>
+            </w:r>
+          </w:p>
+        </w:tc>
+        <w:tc>
+          <w:tcPr>
+            <w:tcW w:type="dxa" w:w="1701"/>
+          </w:tcPr>
+          <w:p>
+            <w:r/>
+            <w:r>
+              <w:rPr>
+                <w:sz w:val="20"/>
+              </w:rPr>
+              <w:t>0.877</w:t>
+            </w:r>
+          </w:p>
+        </w:tc>
+        <w:tc>
+          <w:tcPr>
+            <w:tcW w:type="dxa" w:w="1701"/>
+          </w:tcPr>
+          <w:p>
+            <w:r/>
+            <w:r>
+              <w:rPr>
+                <w:sz w:val="20"/>
+              </w:rPr>
+              <w:t>0.978</w:t>
+            </w:r>
+          </w:p>
+        </w:tc>
+        <w:tc>
+          <w:tcPr>
+            <w:tcW w:type="dxa" w:w="1701"/>
+          </w:tcPr>
+          <w:p>
+            <w:r/>
+            <w:r>
+              <w:rPr>
+                <w:sz w:val="20"/>
+              </w:rPr>
+              <w:t>HUE (clear)</w:t>
+            </w:r>
+          </w:p>
+        </w:tc>
+      </w:tr>
+      <w:tr>
+        <w:tc>
+          <w:tcPr>
+            <w:tcW w:type="dxa" w:w="3969"/>
+          </w:tcPr>
+          <w:p>
+            <w:r/>
+            <w:r>
+              <w:rPr>
+                <w:sz w:val="20"/>
+              </w:rPr>
+              <w:t>Suite 3: Per-CVD wins (out of 6 categories: ΔE × SSIM × 3)</w:t>
+            </w:r>
+          </w:p>
+        </w:tc>
+        <w:tc>
+          <w:tcPr>
+            <w:tcW w:type="dxa" w:w="1701"/>
+          </w:tcPr>
+          <w:p>
+            <w:r/>
+            <w:r>
+              <w:rPr>
+                <w:sz w:val="20"/>
+              </w:rPr>
+              <w:t>1</w:t>
+            </w:r>
+          </w:p>
+        </w:tc>
+        <w:tc>
+          <w:tcPr>
+            <w:tcW w:type="dxa" w:w="1701"/>
+          </w:tcPr>
+          <w:p>
+            <w:r/>
+            <w:r>
+              <w:rPr>
+                <w:sz w:val="20"/>
+              </w:rPr>
+              <w:t>5</w:t>
+            </w:r>
+          </w:p>
+        </w:tc>
+        <w:tc>
+          <w:tcPr>
+            <w:tcW w:type="dxa" w:w="1701"/>
+          </w:tcPr>
+          <w:p>
+            <w:r/>
+            <w:r>
+              <w:rPr>
+                <w:sz w:val="20"/>
+              </w:rPr>
+              <w:t>HUE</w:t>
+            </w:r>
+          </w:p>
+        </w:tc>
+      </w:tr>
+      <w:tr>
+        <w:tc>
+          <w:tcPr>
+            <w:tcW w:type="dxa" w:w="3969"/>
+          </w:tcPr>
+          <w:p>
+            <w:r/>
+            <w:r>
+              <w:rPr>
+                <w:sz w:val="20"/>
+              </w:rPr>
+              <w:t>Suite 6: Mean latency (lower = faster execution)</w:t>
+            </w:r>
+          </w:p>
+        </w:tc>
+        <w:tc>
+          <w:tcPr>
+            <w:tcW w:type="dxa" w:w="1701"/>
+          </w:tcPr>
+          <w:p>
+            <w:r/>
+            <w:r>
+              <w:rPr>
+                <w:sz w:val="20"/>
+              </w:rPr>
+              <w:t>53.6 ms</w:t>
+            </w:r>
+          </w:p>
+        </w:tc>
+        <w:tc>
+          <w:tcPr>
+            <w:tcW w:type="dxa" w:w="1701"/>
+          </w:tcPr>
+          <w:p>
+            <w:r/>
+            <w:r>
+              <w:rPr>
+                <w:sz w:val="20"/>
+              </w:rPr>
+              <w:t>66.9 ms</w:t>
+            </w:r>
+          </w:p>
+        </w:tc>
+        <w:tc>
+          <w:tcPr>
+            <w:tcW w:type="dxa" w:w="1701"/>
+          </w:tcPr>
+          <w:p>
+            <w:r/>
+            <w:r>
+              <w:rPr>
+                <w:sz w:val="20"/>
+              </w:rPr>
+              <w:t>DAL</w:t>
+            </w:r>
+          </w:p>
+        </w:tc>
+      </w:tr>
+    </w:tbl>
+    <w:p>
+      <w:r>
+        <w:rPr>
+          <w:b/>
+          <w:i w:val="0"/>
+        </w:rPr>
+        <w:t>Daltonization wins ONLY on speed. On every visual-quality metric the harness measures, Hue Rotation produces output that is closer to the original (lower ΔE under CVD perception) and structurally more similar (higher SSIM). This is the opposite of the theoretical prediction.</w:t>
+      </w:r>
+    </w:p>
+    <w:p>
+      <w:pPr>
+        <w:pStyle w:val="Heading3"/>
+      </w:pPr>
+      <w:r>
+        <w:rPr>
+          <w:color w:val="5070C0"/>
+        </w:rPr>
+        <w:t>3.6.1.2 — Why the report does NOT actually invalidate Daltonization</w:t>
+      </w:r>
+    </w:p>
+    <w:p>
+      <w:r>
+        <w:rPr>
+          <w:b w:val="0"/>
+          <w:i w:val="0"/>
+        </w:rPr>
+        <w:t>There is a metric mismatch in the evaluation. This is the most important paragraph in this section — memorise the structure of the argument:</w:t>
+      </w:r>
+    </w:p>
+    <w:p>
+      <w:r>
+        <w:rPr>
+          <w:b/>
+          <w:i w:val="0"/>
+        </w:rPr>
+        <w:t xml:space="preserve">Suite 1 measures: </w:t>
+      </w:r>
+      <w:r>
+        <w:rPr>
+          <w:b w:val="0"/>
+          <w:i w:val="0"/>
+        </w:rPr>
+        <w:t>"after CVD perception of the enhanced image, how close does it look to the ORIGINAL normal-vision view?" Lower ΔE means the enhanced image — once a CVD user looks at it — is perceptually similar to what a normal-vision viewer sees in the unmodified original.</w:t>
+      </w:r>
+    </w:p>
+    <w:p>
+      <w:r>
+        <w:rPr>
+          <w:b/>
+          <w:i w:val="0"/>
+        </w:rPr>
+        <w:t xml:space="preserve">Why this is the wrong question for enhancement: </w:t>
+      </w:r>
+      <w:r>
+        <w:rPr>
+          <w:b w:val="0"/>
+          <w:i w:val="0"/>
+        </w:rPr>
+        <w:t>Enhancement cannot make a CVD user perceive what a normal-vision user perceives. The cones that distinguish red from green are physiologically missing or shifted in protan/deutan vision. No amount of pixel manipulation can synthesise the missing channel response. So measuring "closeness to original normal view" is measuring an unattainable target — both algorithms fail because the goal is impossible, not because the algorithms are bad.</w:t>
+      </w:r>
+    </w:p>
+    <w:p>
+      <w:r>
+        <w:rPr>
+          <w:b/>
+          <w:i w:val="0"/>
+        </w:rPr>
+        <w:t xml:space="preserve">What enhancement is ACTUALLY for: </w:t>
+      </w:r>
+      <w:r>
+        <w:rPr>
+          <w:b w:val="0"/>
+          <w:i w:val="0"/>
+        </w:rPr>
+        <w:t>Making previously-confused color pairs (red vs green for protan, blue vs yellow for tritan) discriminable AT THE CVD VIEWING STAGE. The right metric would be: "for color pairs that produce low ΔE under CVD simulation of the unenhanced image (i.e. confused pairs), does the enhanced version produce HIGHER ΔE between those same pairs after CVD simulation?" Neither Suite 1 nor Suite 2 measures this. Suite 1 does the opposite — it rewards algorithms that change the image LEAST.</w:t>
+      </w:r>
+    </w:p>
+    <w:p>
+      <w:r>
+        <w:rPr>
+          <w:b/>
+          <w:i w:val="0"/>
+        </w:rPr>
+        <w:t xml:space="preserve">Why Hue Rotation "wins" Suite 2 (SSIM): </w:t>
+      </w:r>
+      <w:r>
+        <w:rPr>
+          <w:b w:val="0"/>
+          <w:i w:val="0"/>
+        </w:rPr>
+        <w:t>Hue Rotation only touches pixels inside a narrow hue band (60° around red). It leaves everything else untouched. That preserves structure trivially — large regions of the image are bit-for-bit identical. Daltonization touches every pixel that has a non-zero error term, which is most of them. Higher SSIM here reflects "fewer pixels modified", not "better discrimination provided".</w:t>
+      </w:r>
+    </w:p>
+    <w:p>
+      <w:pPr>
+        <w:pStyle w:val="Heading3"/>
+      </w:pPr>
+      <w:r>
+        <w:rPr>
+          <w:color w:val="5070C0"/>
+        </w:rPr>
+        <w:t>3.6.1.3 — What you should say if a panelist confronts you with the report</w:t>
+      </w:r>
+    </w:p>
+    <w:p>
+      <w:r>
+        <w:rPr>
+          <w:b w:val="0"/>
+          <w:i w:val="0"/>
+        </w:rPr>
+        <w:t>Three rehearsable responses, in order of likelihood:</w:t>
+      </w:r>
+    </w:p>
+    <w:p>
+      <w:pPr>
+        <w:ind w:left="425" w:right="425"/>
+      </w:pPr>
+      <w:r>
+        <w:rPr>
+          <w:i/>
+          <w:color w:val="444444"/>
+        </w:rPr>
+        <w:t>Q: "Your own evaluation says Hue Rotation wins on quality metrics. Why is Daltonization the default?"</w:t>
+        <w:br/>
+        <w:br/>
+        <w:t>A: "The metrics that show Hue Rotation winning measure preservation of the original image, not discrimination gain for the CVD user. Suite 1 specifically scores how close the CVD-perceived enhanced image is to the original normal-vision view, but no enhancement algorithm can close that gap because the missing cone information is physiologically unrecoverable. A future evaluation should measure the discrimination delta between confused color pairs before and after enhancement — under that metric we expect Daltonization to win because it actively redistributes the lost channel information into surviving channels, while Hue Rotation only shifts hues within a fixed band."</w:t>
+      </w:r>
+    </w:p>
+    <w:p>
+      <w:pPr>
+        <w:ind w:left="425" w:right="425"/>
+      </w:pPr>
+      <w:r>
+        <w:rPr>
+          <w:i/>
+          <w:color w:val="444444"/>
+        </w:rPr>
+        <w:t>Q: "If your metric is wrong, why did you ship this evaluation in the first place?"</w:t>
+        <w:br/>
+        <w:br/>
+        <w:t>A: "Suite 1 measures faithfulness, which is a useful property but not the only one. The evaluation was useful for confirming Suites 4 and 5 — Identifier accuracy at 85.4% and Simulation precision under 0.1 ΔE — which directly validate two of the three camera modes. For Enhancement, the evaluation prompted us to refine the metric framework, which is itself a research contribution: it shows that the standard image-similarity metrics from photography (ΔE-vs-original, SSIM) are not the right tools for evaluating accessibility-oriented enhancement. That methodological insight goes in the discussion section."</w:t>
+      </w:r>
+    </w:p>
+    <w:p>
+      <w:pPr>
+        <w:ind w:left="425" w:right="425"/>
+      </w:pPr>
+      <w:r>
+        <w:rPr>
+          <w:i/>
+          <w:color w:val="444444"/>
+        </w:rPr>
+        <w:t>Q: "So is Daltonization actually better, or are you rationalising?"</w:t>
+        <w:br/>
+        <w:br/>
+        <w:t>A: "On a discrimination-gain metric — which is what enhancement should be evaluated on — Daltonization is the principled choice because it is mathematically derived to maximise recovery of the lost cone signal. Hue Rotation cannot do this by construction; it only rotates hues, it does not redistribute energy across channels. We did not run a discrimination-gain benchmark in this evaluation cycle, so the strongest defensible claim is: theoretical analysis favours Daltonization, current empirical evaluation favours Hue Rotation on unmodified-image preservation, and the gap between those is itself the research finding."</w:t>
+      </w:r>
+    </w:p>
+    <w:p>
+      <w:pPr>
+        <w:pStyle w:val="Heading3"/>
+      </w:pPr>
+      <w:r>
+        <w:rPr>
+          <w:color w:val="5070C0"/>
+        </w:rPr>
+        <w:t>3.6.1.4 — What NOT to say</w:t>
+      </w:r>
+    </w:p>
+    <w:p>
+      <w:pPr>
+        <w:pStyle w:val="ListBullet"/>
+      </w:pPr>
+      <w:r>
+        <w:t>DO NOT claim the report is wrong. The numbers are correct; the metric framework is just narrow.</w:t>
+      </w:r>
+    </w:p>
+    <w:p>
+      <w:pPr>
+        <w:pStyle w:val="ListBullet"/>
+      </w:pPr>
+      <w:r>
+        <w:t>DO NOT claim Daltonization beats Hue Rotation in absolute terms — the evaluation does not support that.</w:t>
+      </w:r>
+    </w:p>
+    <w:p>
+      <w:pPr>
+        <w:pStyle w:val="ListBullet"/>
+      </w:pPr>
+      <w:r>
+        <w:t>DO NOT hide the report. If a panelist asks "did you evaluate empirically?" and you say no, they will find the report file in your repo.</w:t>
+      </w:r>
+    </w:p>
+    <w:p>
+      <w:pPr>
+        <w:pStyle w:val="ListBullet"/>
+      </w:pPr>
+      <w:r>
+        <w:t>DO NOT say "we will fix it later" without specifying what. Say specifically: "next iteration adds a discrimination-gain benchmark using LMS-space confusion-line endpoints."</w:t>
+      </w:r>
+    </w:p>
+    <w:p>
+      <w:pPr>
+        <w:pStyle w:val="Heading3"/>
+      </w:pPr>
+      <w:r>
+        <w:rPr>
+          <w:color w:val="5070C0"/>
+        </w:rPr>
+        <w:t>3.6.1.5 — One-sentence elevator version</w:t>
+      </w:r>
+    </w:p>
+    <w:p>
+      <w:pPr>
+        <w:ind w:left="425" w:right="425"/>
+      </w:pPr>
+      <w:r>
+        <w:rPr>
+          <w:i/>
+          <w:color w:val="444444"/>
+        </w:rPr>
+        <w:t>The empirical evaluation rewards visual fidelity to the unmodified original — a target no CVD enhancement can reach by design — so its "Hue Rotation wins" verdict reflects metric choice rather than algorithm quality. Daltonization remains the principled default; the evaluation framework needs a discrimination-gain metric for a clean comparative verdict.</w:t>
+      </w:r>
+    </w:p>
+    <w:p>
+      <w:pPr>
+        <w:pStyle w:val="Heading2"/>
+      </w:pPr>
+      <w:r>
+        <w:rPr>
+          <w:color w:val="2E50B0"/>
+        </w:rPr>
         <w:t>3.7 — Instant re-enhancement via cached decodedRef</w:t>
       </w:r>
     </w:p>
@@ -4234,6 +4805,48 @@
           <w:color w:val="444444"/>
         </w:rPr>
         <w:t>Camera sensor noise dominates dark regions — RGB values jump around ±15. Daltonization's gamma decode pushes dark values even further toward zero (pow 2.2 compresses the low end), so noise becomes negligible in linear space. But the corrected output is also mostly dark, and the user cannot distinguish colors in darkness regardless of correction. Low-light enhancement is a separate problem not addressed by daltonization.</w:t>
+      </w:r>
+    </w:p>
+    <w:p>
+      <w:r>
+        <w:rPr>
+          <w:b/>
+          <w:color w:val="1F3A93"/>
+        </w:rPr>
+        <w:t>"Your evaluation_report.md says Hue Rotation has lower ΔE and higher SSIM than Daltonization. Doesn't that contradict your claim that Daltonization is the better algorithm?"</w:t>
+      </w:r>
+    </w:p>
+    <w:p>
+      <w:pPr>
+        <w:ind w:left="425" w:right="425"/>
+      </w:pPr>
+      <w:r>
+        <w:rPr>
+          <w:i/>
+          <w:color w:val="444444"/>
+        </w:rPr>
+        <w:t>Yes — and that contradiction is treated explicitly in section 3.6.1 of this reviewer. The short version: Suite 1's ΔE measures how close the CVD-perceived enhanced image is to the ORIGINAL normal-vision view. That is an unattainable target — no enhancement can synthesise the missing cone signal — so both algorithms fail on absolute scale. Hue Rotation 'wins' that metric because it touches fewer pixels (narrow 60° hue band only), so by default it stays closer to the original. Daltonization touches every pixel with a non-zero error term, which lowers its ΔE-to-original score even when it actually provides better discrimination. The right metric is discrimination GAIN between confused color pairs after CVD perception of the enhanced image — we did not run that benchmark this cycle, and that is the next iteration of the evaluation. I am not claiming the report is wrong; I am claiming its metric is narrow.</w:t>
+      </w:r>
+    </w:p>
+    <w:p>
+      <w:r>
+        <w:rPr>
+          <w:b/>
+          <w:color w:val="1F3A93"/>
+        </w:rPr>
+        <w:t>"If Hue Rotation is faster on every measurement except mean latency, why ship Daltonization as the default?"</w:t>
+      </w:r>
+    </w:p>
+    <w:p>
+      <w:pPr>
+        <w:ind w:left="425" w:right="425"/>
+      </w:pPr>
+      <w:r>
+        <w:rPr>
+          <w:i/>
+          <w:color w:val="444444"/>
+        </w:rPr>
+        <w:t>Hue Rotation is SLOWER, not faster — Suite 6 shows DAL at 53.6 ms mean and HUE at 66.9 ms mean. Hue Rotation wins on faithfulness metrics (ΔE, SSIM) because it modifies less of the image. The default is Daltonization for two reasons: (1) it is mathematically derived from the physical loss model (Brettel/Fidaner), so its corrections are principled rather than tuned; (2) its self-gating property means it does nothing when nothing needs doing — the user does not have to know which colors are in their confusion set. Hue Rotation requires us to define a band per CVD type by hand. Daltonization is therefore the more general default; Hue Rotation ships as a comparative option for power users and for the research contribution.</w:t>
       </w:r>
     </w:p>
     <w:p>

</xml_diff>